<commit_message>
Atualização do projeto para incluir a infraestrutura como código usando Terraform, além de ajustes na documentação e adição de novos arquivos de configuração e scripts.
</commit_message>
<xml_diff>
--- a/monografia_v2.docx
+++ b/monografia_v2.docx
@@ -49,7 +49,7 @@
           <w:bCs/>
           <w:color w:val="000000"/>
         </w:rPr>
-        <w:t>SISTEMA PARA DETECCAO E CLASSIFICACAO DE EVENTOS</w:t>
+        <w:t>DETECCAO E CLASSIFICACAO DE EVENTOS INDESEJAVEIS EM POCOS OFFSHORE</w:t>
       </w:r>
     </w:p>
     <w:p>
@@ -64,7 +64,7 @@
           <w:bCs/>
           <w:color w:val="000000"/>
         </w:rPr>
-        <w:t>INDESEJAVEIS EM POCOS DE PETROLEO OFFSHORE</w:t>
+        <w:t>COM MACHINE LEARNING E ENGENHARIA DE DADOS</w:t>
       </w:r>
     </w:p>
     <w:p>
@@ -176,7 +176,7 @@
           <w:bCs/>
           <w:color w:val="000000"/>
         </w:rPr>
-        <w:t>SISTEMA PARA DETECCAO E CLASSIFICACAO DE EVENTOS</w:t>
+        <w:t>DETECCAO E CLASSIFICACAO DE EVENTOS INDESEJAVEIS EM POCOS OFFSHORE</w:t>
       </w:r>
     </w:p>
     <w:p>
@@ -191,7 +191,7 @@
           <w:bCs/>
           <w:color w:val="000000"/>
         </w:rPr>
-        <w:t>INDESEJAVEIS EM POCOS DE PETROLEO OFFSHORE</w:t>
+        <w:t>COM MACHINE LEARNING E ENGENHARIA DE DADOS</w:t>
       </w:r>
     </w:p>
     <w:p>
@@ -449,7 +449,7 @@
               <w:spacing w:line="360" w:lineRule="auto"/>
             </w:pPr>
             <w:r>
-              <w:t>Sistema para detecção e classificação de eventos indesejáveis em poços de petróleo offshore / Alan Pinheiro da Silva. -- São Paulo, 2026.</w:t>
+              <w:t>Detecção e classificação de eventos indesejáveis em poços offshore com machine learning e engenharia de dados / Alan Pinheiro da Silva. -- São Paulo, 2026.</w:t>
             </w:r>
             <w:r>
               <w:br/>
@@ -21860,6 +21860,183 @@
     </w:p>
     <w:p>
       <w:pPr>
+        <w:pStyle w:val="Ttulo2"/>
+        <w:numPr>
+          <w:ilvl w:val="0"/>
+          <w:numId w:val="0"/>
+        </w:numPr>
+      </w:pPr>
+      <w:r>
+        <w:t>3.10 Infraestrutura de Implantacao em Nuvem AWS</w:t>
+      </w:r>
+    </w:p>
+    <w:p>
+      <w:pPr>
+        <w:pStyle w:val="Normal"/>
+        <w:jc w:val="both"/>
+      </w:pPr>
+      <w:r>
+        <w:t xml:space="preserve">O projeto foi inicialmente desenvolvido em ambiente local com Docker Compose, permitindo ciclos rapidos de desenvolvimento, testes e validacao dos modelos de machine learning sem incorrer em custos de infraestrutura. Apos a validacao do pipeline e dos resultados com os tres pocos de referencia (WELL-00002, WELL-00004 e WELL-00006), a infraestrutura foi migrada para a nuvem AWS utilizando Terraform como ferramenta de Infrastructure as Code (IaC), seguindo a estrategia progressiva: ambiente local para desenvolvimento, nuvem para producao e escala.</w:t>
+      </w:r>
+    </w:p>
+    <w:p>
+      <w:pPr>
+        <w:pStyle w:val="Ttulo3"/>
+      </w:pPr>
+      <w:r>
+        <w:t>3.10.1 Estrategia de Deploy Local para Nuvem</w:t>
+      </w:r>
+    </w:p>
+    <w:p>
+      <w:pPr>
+        <w:pStyle w:val="Normal"/>
+        <w:jc w:val="both"/>
+      </w:pPr>
+      <w:r>
+        <w:t xml:space="preserve">A abordagem adotada parte de um principio de maturidade progressiva: o ambiente local replica fielmente os componentes de producao (Apache Airflow, PostgreSQL, MinIO/S3, Jupyter Lab e AWS Glue Local), possibilitando o desenvolvimento e teste sem dependencia de conectividade ou custos. A migracao para a AWS e executada via Terraform, garantindo reproducibilidade, rastreabilidade das configuracoes em controle de versao (Git) e eliminando a configuracao manual propensa a erros.</w:t>
+      </w:r>
+    </w:p>
+    <w:p>
+      <w:pPr>
+        <w:pStyle w:val="Normal"/>
+        <w:jc w:val="both"/>
+      </w:pPr>
+      <w:r>
+        <w:t xml:space="preserve">Uma restricao importante do ambiente academico e o uso da conta AWS Academy com a politica LabRole, que limita a criacao de recursos IAM customizados. A solucao adotada utiliza o perfil LabInstanceProfile pre-existente, atribuido automaticamente a instancia EC2, concedendo acesso aos buckets S3 sem necessidade de chaves de acesso hardcoded no codigo -- pratica alinhada com as melhores praticas de seguranca em nuvem.</w:t>
+      </w:r>
+    </w:p>
+    <w:p>
+      <w:pPr>
+        <w:pStyle w:val="Ttulo3"/>
+      </w:pPr>
+      <w:r>
+        <w:t>3.10.2 Componentes da Infraestrutura AWS</w:t>
+      </w:r>
+    </w:p>
+    <w:p>
+      <w:pPr>
+        <w:pStyle w:val="Normal"/>
+        <w:jc w:val="both"/>
+      </w:pPr>
+      <w:r>
+        <w:t xml:space="preserve">A Figura 3.x apresenta a arquitetura completa de implantacao, evidenciando a transicao do ambiente local para a nuvem AWS. A infraestrutura e composta por 27 recursos provisionados via Terraform, organizados em:</w:t>
+      </w:r>
+    </w:p>
+    <w:p>
+      <w:pPr>
+        <w:pStyle w:val="Normal"/>
+        <w:jc w:val="both"/>
+        <w:ind w:left="720"/>
+      </w:pPr>
+      <w:r>
+        <w:t xml:space="preserve">a) Rede: VPC dedicada (10.0.0.0/16) com subnet publica em us-east-1a, Internet Gateway e Security Group restrito ao IP do desenvolvedor nas portas 22 (SSH), 8080 (Airflow), 8888 (Jupyter), 8501 (Streamlit) e 9001 (MinIO);</w:t>
+      </w:r>
+    </w:p>
+    <w:p>
+      <w:pPr>
+        <w:pStyle w:val="Normal"/>
+        <w:jc w:val="both"/>
+        <w:ind w:left="720"/>
+      </w:pPr>
+      <w:r>
+        <w:t xml:space="preserve">b) Computacao: instancia EC2 t3.large (8 GB RAM, 30 GB SSD gp3, Ubuntu 22.04 LTS) executando a stack Docker Compose com Apache Airflow 2.9.2, PostgreSQL 15, Jupyter Lab e o pipeline de processamento;</w:t>
+      </w:r>
+    </w:p>
+    <w:p>
+      <w:pPr>
+        <w:pStyle w:val="Normal"/>
+        <w:jc w:val="both"/>
+        <w:ind w:left="720"/>
+      </w:pPr>
+      <w:r>
+        <w:t xml:space="preserve">c) Armazenamento: seis buckets Amazon S3 implementando a Arquitetura Medallion (raw, bronze, silver, gold, models, logs), todos com criptografia AES-256 e bloqueio de acesso publico.</w:t>
+      </w:r>
+    </w:p>
+    <w:p>
+      <w:pPr>
+        <w:pStyle w:val="Normal"/>
+        <w:jc w:val="both"/>
+      </w:pPr>
+      <w:r>
+        <w:t xml:space="preserve">A opcao por PostgreSQL em container Docker em vez do servico gerenciado Amazon RDS foi motivada por restricoes orcamentarias do projeto academico (orcamento total de USD 50), reduzindo o custo estimado de USD 75-90/mes para aproximadamente USD 30-35 no periodo de validacao com os tres pocos.</w:t>
+      </w:r>
+    </w:p>
+    <w:p>
+      <w:pPr>
+        <w:pStyle w:val="Normal"/>
+        <w:jc w:val="both"/>
+      </w:pPr>
+      <w:r>
+        <w:rPr>
+          <w:b/>
+        </w:rPr>
+        <w:t xml:space="preserve">Figura 3.x </w:t>
+      </w:r>
+      <w:r>
+        <w:t xml:space="preserve">-- Arquitetura de Implantacao: Ambiente Local versus Nuvem AWS. Fonte: elaborado pelo autor.</w:t>
+      </w:r>
+    </w:p>
+    <w:p>
+      <w:pPr>
+        <w:jc w:val="center"/>
+      </w:pPr>
+      <w:r>
+        <w:drawing>
+          <wp:inline distT="0" distB="0" distL="0" distR="0">
+            <wp:extent cx="5039055" cy="2815942"/>
+            <wp:effectExtent l="0" t="0" r="0" b="0"/>
+            <wp:docPr id="201" name="Figura_Arq_AWS" descr="Arquitetura de implantacao local e AWS"/>
+            <wp:cNvGraphicFramePr>
+              <a:graphicFrameLocks xmlns:a="http://schemas.openxmlformats.org/drawingml/2006/main" noChangeAspect="1"/>
+            </wp:cNvGraphicFramePr>
+            <a:graphic xmlns:a="http://schemas.openxmlformats.org/drawingml/2006/main">
+              <a:graphicData uri="http://schemas.openxmlformats.org/drawingml/2006/picture">
+                <pic:pic xmlns:pic="http://schemas.openxmlformats.org/drawingml/2006/picture">
+                  <pic:nvPicPr>
+                    <pic:cNvPr id="201" name="Figura_Arq_AWS"/>
+                    <pic:cNvPicPr/>
+                  </pic:nvPicPr>
+                  <pic:blipFill>
+                    <a:blip r:embed="rId24"/>
+                    <a:stretch>
+                      <a:fillRect/>
+                    </a:stretch>
+                  </pic:blipFill>
+                  <pic:spPr>
+                    <a:xfrm>
+                      <a:off x="0" y="0"/>
+                      <a:ext cx="5039055" cy="2815942"/>
+                    </a:xfrm>
+                    <a:prstGeom prst="rect">
+                      <a:avLst/>
+                    </a:prstGeom>
+                  </pic:spPr>
+                </pic:pic>
+              </a:graphicData>
+            </a:graphic>
+          </wp:inline>
+        </w:drawing>
+      </w:r>
+    </w:p>
+    <w:p>
+      <w:pPr>
+        <w:pStyle w:val="Ttulo3"/>
+      </w:pPr>
+      <w:r>
+        <w:t>3.10.3 Otimizacoes para o Contexto Academico</w:t>
+      </w:r>
+    </w:p>
+    <w:p>
+      <w:pPr>
+        <w:pStyle w:val="Normal"/>
+        <w:jc w:val="both"/>
+      </w:pPr>
+      <w:r>
+        <w:t xml:space="preserve">O gerenciamento do orcamento e viabilizado pela disciplina operacional de ligar a instancia EC2 apenas durante as sessoes de trabalho (media de 6 horas/dia), desligando-a ao termino. Com esse padrao de uso, o custo estimado para dois meses de projeto e de aproximadamente USD 30-35, mantendo uma margem de seguranca de USD 15 dentro do limite academico. Os dados dos tres pocos permanecem persistidos nos buckets S3 (cuja cobranca e proporcional ao armazenamento, negligivel para os 500 MB do dataset reduzido), e o estado do sistema e restaurado automaticamente ao religar a instancia via Docker Compose.</w:t>
+      </w:r>
+    </w:p>
+    <w:p>
+      <w:pPr>
         <w:pStyle w:val="Ttulo1"/>
         <w:spacing w:after="120" w:line="360" w:lineRule="auto"/>
       </w:pPr>
@@ -23095,1152 +23272,4 @@
     </w:pPr>
   </w:p>
 </w:hdr>
-</file>
-
-<file path=word/numbering.xml><?xml version="1.0" encoding="utf-8"?>
-<w:numbering xmlns:wpc="http://schemas.microsoft.com/office/word/2010/wordprocessingCanvas" xmlns:cx="http://schemas.microsoft.com/office/drawing/2014/chartex" xmlns:cx1="http://schemas.microsoft.com/office/drawing/2015/9/8/chartex" xmlns:cx2="http://schemas.microsoft.com/office/drawing/2015/10/21/chartex" xmlns:cx3="http://schemas.microsoft.com/office/drawing/2016/5/9/chartex" xmlns:cx4="http://schemas.microsoft.com/office/drawing/2016/5/10/chartex" xmlns:cx5="http://schemas.microsoft.com/office/drawing/2016/5/11/chartex" xmlns:cx6="http://schemas.microsoft.com/office/drawing/2016/5/12/chartex" xmlns:cx7="http://schemas.microsoft.com/office/drawing/2016/5/13/chartex" xmlns:cx8="http://schemas.microsoft.com/office/drawing/2016/5/14/chartex" xmlns:mc="http://schemas.openxmlformats.org/markup-compatibility/2006" xmlns:aink="http://schemas.microsoft.com/office/drawing/2016/ink" xmlns:am3d="http://schemas.microsoft.com/office/drawing/2017/model3d" xmlns:o="urn:schemas-microsoft-com:office:office" xmlns:oel="http://schemas.microsoft.com/office/2019/extlst" xmlns:r="http://schemas.openxmlformats.org/officeDocument/2006/relationships" xmlns:m="http://schemas.openxmlformats.org/officeDocument/2006/math" xmlns:v="urn:schemas-microsoft-com:vml" xmlns:wp14="http://schemas.microsoft.com/office/word/2010/wordprocessingDrawing" xmlns:wp="http://schemas.openxmlformats.org/drawingml/2006/wordprocessingDrawing" xmlns:w10="urn:schemas-microsoft-com:office:word" xmlns:w="http://schemas.openxmlformats.org/wordprocessingml/2006/main" xmlns:w14="http://schemas.microsoft.com/office/word/2010/wordml" xmlns:w15="http://schemas.microsoft.com/office/word/2012/wordml" xmlns:w16cex="http://schemas.microsoft.com/office/word/2018/wordml/cex" xmlns:w16cid="http://schemas.microsoft.com/office/word/2016/wordml/cid" xmlns:w16="http://schemas.microsoft.com/office/word/2018/wordml" xmlns:w16du="http://schemas.microsoft.com/office/word/2023/wordml/word16du" xmlns:w16sdtdh="http://schemas.microsoft.com/office/word/2020/wordml/sdtdatahash" xmlns:w16sdtfl="http://schemas.microsoft.com/office/word/2024/wordml/sdtformatlock" xmlns:w16se="http://schemas.microsoft.com/office/word/2015/wordml/symex" xmlns:wpg="http://schemas.microsoft.com/office/word/2010/wordprocessingGroup" xmlns:wpi="http://schemas.microsoft.com/office/word/2010/wordprocessingInk" xmlns:wne="http://schemas.microsoft.com/office/word/2006/wordml" xmlns:wps="http://schemas.microsoft.com/office/word/2010/wordprocessingShape" mc:Ignorable="w14 w15 w16se w16cid w16 w16cex w16sdtdh w16sdtfl w16du wp14">
-  <w:abstractNum w:abstractNumId="0" w15:restartNumberingAfterBreak="0">
-    <w:nsid w:val="37CC43A8"/>
-    <w:multiLevelType w:val="hybridMultilevel"/>
-    <w:tmpl w:val="8460F4C8"/>
-    <w:lvl w:ilvl="0" w:tplc="21EA502E">
-      <w:start w:val="1"/>
-      <w:numFmt w:val="bullet"/>
-      <w:lvlText w:val="●"/>
-      <w:lvlJc w:val="left"/>
-      <w:pPr>
-        <w:ind w:left="720" w:hanging="360"/>
-      </w:pPr>
-    </w:lvl>
-    <w:lvl w:ilvl="1" w:tplc="8F1470D2">
-      <w:start w:val="1"/>
-      <w:numFmt w:val="bullet"/>
-      <w:lvlText w:val="○"/>
-      <w:lvlJc w:val="left"/>
-      <w:pPr>
-        <w:ind w:left="1440" w:hanging="360"/>
-      </w:pPr>
-    </w:lvl>
-    <w:lvl w:ilvl="2" w:tplc="CC66FBA0">
-      <w:start w:val="1"/>
-      <w:numFmt w:val="bullet"/>
-      <w:lvlText w:val="■"/>
-      <w:lvlJc w:val="left"/>
-      <w:pPr>
-        <w:ind w:left="2160" w:hanging="360"/>
-      </w:pPr>
-    </w:lvl>
-    <w:lvl w:ilvl="3" w:tplc="C512EB4C">
-      <w:start w:val="1"/>
-      <w:numFmt w:val="bullet"/>
-      <w:lvlText w:val="●"/>
-      <w:lvlJc w:val="left"/>
-      <w:pPr>
-        <w:ind w:left="2880" w:hanging="360"/>
-      </w:pPr>
-    </w:lvl>
-    <w:lvl w:ilvl="4" w:tplc="60BEDB46">
-      <w:start w:val="1"/>
-      <w:numFmt w:val="bullet"/>
-      <w:lvlText w:val="○"/>
-      <w:lvlJc w:val="left"/>
-      <w:pPr>
-        <w:ind w:left="3600" w:hanging="360"/>
-      </w:pPr>
-    </w:lvl>
-    <w:lvl w:ilvl="5" w:tplc="C2C6CB62">
-      <w:start w:val="1"/>
-      <w:numFmt w:val="bullet"/>
-      <w:lvlText w:val="■"/>
-      <w:lvlJc w:val="left"/>
-      <w:pPr>
-        <w:ind w:left="4320" w:hanging="360"/>
-      </w:pPr>
-    </w:lvl>
-    <w:lvl w:ilvl="6" w:tplc="195671B0">
-      <w:start w:val="1"/>
-      <w:numFmt w:val="bullet"/>
-      <w:lvlText w:val="●"/>
-      <w:lvlJc w:val="left"/>
-      <w:pPr>
-        <w:ind w:left="5040" w:hanging="360"/>
-      </w:pPr>
-    </w:lvl>
-    <w:lvl w:ilvl="7" w:tplc="E362C32C">
-      <w:start w:val="1"/>
-      <w:numFmt w:val="bullet"/>
-      <w:lvlText w:val="●"/>
-      <w:lvlJc w:val="left"/>
-      <w:pPr>
-        <w:ind w:left="5760" w:hanging="360"/>
-      </w:pPr>
-    </w:lvl>
-    <w:lvl w:ilvl="8" w:tplc="E9002282">
-      <w:start w:val="1"/>
-      <w:numFmt w:val="bullet"/>
-      <w:lvlText w:val="●"/>
-      <w:lvlJc w:val="left"/>
-      <w:pPr>
-        <w:ind w:left="6480" w:hanging="360"/>
-      </w:pPr>
-    </w:lvl>
-  </w:abstractNum>
-  <w:abstractNum w:abstractNumId="1" w15:restartNumberingAfterBreak="0">
-    <w:nsid w:val="76C4048D"/>
-    <w:multiLevelType w:val="hybridMultilevel"/>
-    <w:tmpl w:val="7954F2FA"/>
-    <w:lvl w:ilvl="0" w:tplc="EEC6EB8E">
-      <w:start w:val="1"/>
-      <w:numFmt w:val="bullet"/>
-      <w:lvlText w:val="■"/>
-      <w:lvlJc w:val="left"/>
-      <w:pPr>
-        <w:ind w:left="720" w:hanging="360"/>
-      </w:pPr>
-    </w:lvl>
-    <w:lvl w:ilvl="1" w:tplc="6130C436">
-      <w:numFmt w:val="decimal"/>
-      <w:lvlText w:val=""/>
-      <w:lvlJc w:val="left"/>
-    </w:lvl>
-    <w:lvl w:ilvl="2" w:tplc="E326AA8C">
-      <w:numFmt w:val="decimal"/>
-      <w:lvlText w:val=""/>
-      <w:lvlJc w:val="left"/>
-    </w:lvl>
-    <w:lvl w:ilvl="3" w:tplc="5E426F16">
-      <w:numFmt w:val="decimal"/>
-      <w:lvlText w:val=""/>
-      <w:lvlJc w:val="left"/>
-    </w:lvl>
-    <w:lvl w:ilvl="4" w:tplc="0D8882B6">
-      <w:numFmt w:val="decimal"/>
-      <w:lvlText w:val=""/>
-      <w:lvlJc w:val="left"/>
-    </w:lvl>
-    <w:lvl w:ilvl="5" w:tplc="E790329A">
-      <w:numFmt w:val="decimal"/>
-      <w:lvlText w:val=""/>
-      <w:lvlJc w:val="left"/>
-    </w:lvl>
-    <w:lvl w:ilvl="6" w:tplc="B9E03B48">
-      <w:numFmt w:val="decimal"/>
-      <w:lvlText w:val=""/>
-      <w:lvlJc w:val="left"/>
-    </w:lvl>
-    <w:lvl w:ilvl="7" w:tplc="82BCC48A">
-      <w:numFmt w:val="decimal"/>
-      <w:lvlText w:val=""/>
-      <w:lvlJc w:val="left"/>
-    </w:lvl>
-    <w:lvl w:ilvl="8" w:tplc="8F681692">
-      <w:numFmt w:val="decimal"/>
-      <w:lvlText w:val=""/>
-      <w:lvlJc w:val="left"/>
-    </w:lvl>
-  </w:abstractNum>
-  <w:num w:numId="1" w16cid:durableId="2125230649">
-    <w:abstractNumId w:val="0"/>
-    <w:lvlOverride w:ilvl="0">
-      <w:startOverride w:val="1"/>
-    </w:lvlOverride>
-  </w:num>
-</w:numbering>
-</file>
-
-<file path=word/styles.xml><?xml version="1.0" encoding="utf-8"?>
-<w:styles xmlns:mc="http://schemas.openxmlformats.org/markup-compatibility/2006" xmlns:r="http://schemas.openxmlformats.org/officeDocument/2006/relationships" xmlns:w="http://schemas.openxmlformats.org/wordprocessingml/2006/main" xmlns:w14="http://schemas.microsoft.com/office/word/2010/wordml" xmlns:w15="http://schemas.microsoft.com/office/word/2012/wordml" xmlns:w16cex="http://schemas.microsoft.com/office/word/2018/wordml/cex" xmlns:w16cid="http://schemas.microsoft.com/office/word/2016/wordml/cid" xmlns:w16="http://schemas.microsoft.com/office/word/2018/wordml" xmlns:w16du="http://schemas.microsoft.com/office/word/2023/wordml/word16du" xmlns:w16sdtdh="http://schemas.microsoft.com/office/word/2020/wordml/sdtdatahash" xmlns:w16sdtfl="http://schemas.microsoft.com/office/word/2024/wordml/sdtformatlock" xmlns:w16se="http://schemas.microsoft.com/office/word/2015/wordml/symex" mc:Ignorable="w14 w15 w16se w16cid w16 w16cex w16sdtdh w16sdtfl w16du">
-  <w:docDefaults>
-    <w:rPrDefault>
-      <w:rPr>
-        <w:rFonts w:ascii="Times New Roman" w:eastAsia="Times New Roman" w:hAnsi="Times New Roman" w:cs="Times New Roman"/>
-        <w:sz w:val="24"/>
-        <w:szCs w:val="24"/>
-        <w:lang w:val="pt-BR" w:eastAsia="pt-BR" w:bidi="ar-SA"/>
-      </w:rPr>
-    </w:rPrDefault>
-    <w:pPrDefault/>
-  </w:docDefaults>
-  <w:latentStyles w:defLockedState="0" w:defUIPriority="99" w:defSemiHidden="0" w:defUnhideWhenUsed="0" w:defQFormat="0" w:count="376">
-    <w:lsdException w:name="Normal" w:uiPriority="0" w:qFormat="1"/>
-    <w:lsdException w:name="heading 1" w:uiPriority="9" w:qFormat="1"/>
-    <w:lsdException w:name="heading 2" w:semiHidden="1" w:uiPriority="9" w:unhideWhenUsed="1" w:qFormat="1"/>
-    <w:lsdException w:name="heading 3" w:semiHidden="1" w:uiPriority="9" w:unhideWhenUsed="1" w:qFormat="1"/>
-    <w:lsdException w:name="heading 4" w:semiHidden="1" w:uiPriority="9" w:unhideWhenUsed="1" w:qFormat="1"/>
-    <w:lsdException w:name="heading 5" w:semiHidden="1" w:uiPriority="9" w:unhideWhenUsed="1" w:qFormat="1"/>
-    <w:lsdException w:name="heading 6" w:semiHidden="1" w:uiPriority="9" w:unhideWhenUsed="1" w:qFormat="1"/>
-    <w:lsdException w:name="heading 7" w:semiHidden="1" w:uiPriority="9" w:unhideWhenUsed="1" w:qFormat="1"/>
-    <w:lsdException w:name="heading 8" w:semiHidden="1" w:uiPriority="9" w:unhideWhenUsed="1" w:qFormat="1"/>
-    <w:lsdException w:name="heading 9" w:semiHidden="1" w:uiPriority="9" w:unhideWhenUsed="1" w:qFormat="1"/>
-    <w:lsdException w:name="index 1" w:semiHidden="1" w:unhideWhenUsed="1"/>
-    <w:lsdException w:name="index 2" w:semiHidden="1" w:unhideWhenUsed="1"/>
-    <w:lsdException w:name="index 3" w:semiHidden="1" w:unhideWhenUsed="1"/>
-    <w:lsdException w:name="index 4" w:semiHidden="1" w:unhideWhenUsed="1"/>
-    <w:lsdException w:name="index 5" w:semiHidden="1" w:unhideWhenUsed="1"/>
-    <w:lsdException w:name="index 6" w:semiHidden="1" w:unhideWhenUsed="1"/>
-    <w:lsdException w:name="index 7" w:semiHidden="1" w:unhideWhenUsed="1"/>
-    <w:lsdException w:name="index 8" w:semiHidden="1" w:unhideWhenUsed="1"/>
-    <w:lsdException w:name="index 9" w:semiHidden="1" w:unhideWhenUsed="1"/>
-    <w:lsdException w:name="toc 1" w:semiHidden="1" w:uiPriority="39" w:unhideWhenUsed="1"/>
-    <w:lsdException w:name="toc 2" w:semiHidden="1" w:uiPriority="39" w:unhideWhenUsed="1"/>
-    <w:lsdException w:name="toc 3" w:semiHidden="1" w:uiPriority="39" w:unhideWhenUsed="1"/>
-    <w:lsdException w:name="toc 4" w:semiHidden="1" w:uiPriority="39" w:unhideWhenUsed="1"/>
-    <w:lsdException w:name="toc 5" w:semiHidden="1" w:uiPriority="39" w:unhideWhenUsed="1"/>
-    <w:lsdException w:name="toc 6" w:semiHidden="1" w:uiPriority="39" w:unhideWhenUsed="1"/>
-    <w:lsdException w:name="toc 7" w:semiHidden="1" w:uiPriority="39" w:unhideWhenUsed="1"/>
-    <w:lsdException w:name="toc 8" w:semiHidden="1" w:uiPriority="39" w:unhideWhenUsed="1"/>
-    <w:lsdException w:name="toc 9" w:semiHidden="1" w:uiPriority="39" w:unhideWhenUsed="1"/>
-    <w:lsdException w:name="Normal Indent" w:semiHidden="1" w:unhideWhenUsed="1"/>
-    <w:lsdException w:name="footnote text" w:semiHidden="1" w:unhideWhenUsed="1"/>
-    <w:lsdException w:name="annotation text" w:semiHidden="1" w:unhideWhenUsed="1"/>
-    <w:lsdException w:name="header" w:semiHidden="1" w:unhideWhenUsed="1"/>
-    <w:lsdException w:name="footer" w:semiHidden="1" w:unhideWhenUsed="1"/>
-    <w:lsdException w:name="index heading" w:semiHidden="1" w:unhideWhenUsed="1"/>
-    <w:lsdException w:name="caption" w:semiHidden="1" w:uiPriority="35" w:unhideWhenUsed="1" w:qFormat="1"/>
-    <w:lsdException w:name="table of figures" w:semiHidden="1" w:unhideWhenUsed="1"/>
-    <w:lsdException w:name="envelope address" w:semiHidden="1" w:unhideWhenUsed="1"/>
-    <w:lsdException w:name="envelope return" w:semiHidden="1" w:unhideWhenUsed="1"/>
-    <w:lsdException w:name="footnote reference" w:semiHidden="1" w:unhideWhenUsed="1"/>
-    <w:lsdException w:name="annotation reference" w:semiHidden="1" w:unhideWhenUsed="1"/>
-    <w:lsdException w:name="line number" w:semiHidden="1" w:unhideWhenUsed="1"/>
-    <w:lsdException w:name="page number" w:semiHidden="1" w:unhideWhenUsed="1"/>
-    <w:lsdException w:name="endnote reference" w:semiHidden="1" w:unhideWhenUsed="1"/>
-    <w:lsdException w:name="endnote text" w:semiHidden="1" w:unhideWhenUsed="1"/>
-    <w:lsdException w:name="table of authorities" w:semiHidden="1" w:unhideWhenUsed="1"/>
-    <w:lsdException w:name="macro" w:semiHidden="1" w:unhideWhenUsed="1"/>
-    <w:lsdException w:name="toa heading" w:semiHidden="1" w:unhideWhenUsed="1"/>
-    <w:lsdException w:name="List" w:semiHidden="1" w:unhideWhenUsed="1"/>
-    <w:lsdException w:name="List Bullet" w:semiHidden="1" w:unhideWhenUsed="1"/>
-    <w:lsdException w:name="List Number" w:semiHidden="1" w:unhideWhenUsed="1"/>
-    <w:lsdException w:name="List 2" w:semiHidden="1" w:unhideWhenUsed="1"/>
-    <w:lsdException w:name="List 3" w:semiHidden="1" w:unhideWhenUsed="1"/>
-    <w:lsdException w:name="List 4" w:semiHidden="1" w:unhideWhenUsed="1"/>
-    <w:lsdException w:name="List 5" w:semiHidden="1" w:unhideWhenUsed="1"/>
-    <w:lsdException w:name="List Bullet 2" w:semiHidden="1" w:unhideWhenUsed="1"/>
-    <w:lsdException w:name="List Bullet 3" w:semiHidden="1" w:unhideWhenUsed="1"/>
-    <w:lsdException w:name="List Bullet 4" w:semiHidden="1" w:unhideWhenUsed="1"/>
-    <w:lsdException w:name="List Bullet 5" w:semiHidden="1" w:unhideWhenUsed="1"/>
-    <w:lsdException w:name="List Number 2" w:semiHidden="1" w:unhideWhenUsed="1"/>
-    <w:lsdException w:name="List Number 3" w:semiHidden="1" w:unhideWhenUsed="1"/>
-    <w:lsdException w:name="List Number 4" w:semiHidden="1" w:unhideWhenUsed="1"/>
-    <w:lsdException w:name="List Number 5" w:semiHidden="1" w:unhideWhenUsed="1"/>
-    <w:lsdException w:name="Title" w:uiPriority="10" w:qFormat="1"/>
-    <w:lsdException w:name="Closing" w:semiHidden="1" w:unhideWhenUsed="1"/>
-    <w:lsdException w:name="Signature" w:semiHidden="1" w:unhideWhenUsed="1"/>
-    <w:lsdException w:name="Default Paragraph Font" w:semiHidden="1" w:uiPriority="1" w:unhideWhenUsed="1"/>
-    <w:lsdException w:name="Body Text" w:semiHidden="1" w:unhideWhenUsed="1"/>
-    <w:lsdException w:name="Body Text Indent" w:semiHidden="1" w:unhideWhenUsed="1"/>
-    <w:lsdException w:name="List Continue" w:semiHidden="1" w:unhideWhenUsed="1"/>
-    <w:lsdException w:name="List Continue 2" w:semiHidden="1" w:unhideWhenUsed="1"/>
-    <w:lsdException w:name="List Continue 3" w:semiHidden="1" w:unhideWhenUsed="1"/>
-    <w:lsdException w:name="List Continue 4" w:semiHidden="1" w:unhideWhenUsed="1"/>
-    <w:lsdException w:name="List Continue 5" w:semiHidden="1" w:unhideWhenUsed="1"/>
-    <w:lsdException w:name="Message Header" w:semiHidden="1" w:unhideWhenUsed="1"/>
-    <w:lsdException w:name="Subtitle" w:uiPriority="11" w:qFormat="1"/>
-    <w:lsdException w:name="Salutation" w:semiHidden="1" w:unhideWhenUsed="1"/>
-    <w:lsdException w:name="Date" w:semiHidden="1" w:unhideWhenUsed="1"/>
-    <w:lsdException w:name="Body Text First Indent" w:semiHidden="1" w:unhideWhenUsed="1"/>
-    <w:lsdException w:name="Body Text First Indent 2" w:semiHidden="1" w:unhideWhenUsed="1"/>
-    <w:lsdException w:name="Note Heading" w:semiHidden="1" w:unhideWhenUsed="1"/>
-    <w:lsdException w:name="Body Text 2" w:semiHidden="1" w:unhideWhenUsed="1"/>
-    <w:lsdException w:name="Body Text 3" w:semiHidden="1" w:unhideWhenUsed="1"/>
-    <w:lsdException w:name="Body Text Indent 2" w:semiHidden="1" w:unhideWhenUsed="1"/>
-    <w:lsdException w:name="Body Text Indent 3" w:semiHidden="1" w:unhideWhenUsed="1"/>
-    <w:lsdException w:name="Block Text" w:semiHidden="1" w:unhideWhenUsed="1"/>
-    <w:lsdException w:name="Hyperlink" w:semiHidden="1" w:unhideWhenUsed="1"/>
-    <w:lsdException w:name="FollowedHyperlink" w:semiHidden="1" w:unhideWhenUsed="1"/>
-    <w:lsdException w:name="Strong" w:uiPriority="22" w:qFormat="1"/>
-    <w:lsdException w:name="Emphasis" w:uiPriority="20" w:qFormat="1"/>
-    <w:lsdException w:name="Document Map" w:semiHidden="1" w:unhideWhenUsed="1"/>
-    <w:lsdException w:name="Plain Text" w:semiHidden="1" w:unhideWhenUsed="1"/>
-    <w:lsdException w:name="E-mail Signature" w:semiHidden="1" w:unhideWhenUsed="1"/>
-    <w:lsdException w:name="HTML Top of Form" w:semiHidden="1" w:unhideWhenUsed="1"/>
-    <w:lsdException w:name="HTML Bottom of Form" w:semiHidden="1" w:unhideWhenUsed="1"/>
-    <w:lsdException w:name="Normal (Web)" w:semiHidden="1" w:unhideWhenUsed="1"/>
-    <w:lsdException w:name="HTML Acronym" w:semiHidden="1" w:unhideWhenUsed="1"/>
-    <w:lsdException w:name="HTML Address" w:semiHidden="1" w:unhideWhenUsed="1"/>
-    <w:lsdException w:name="HTML Cite" w:semiHidden="1" w:unhideWhenUsed="1"/>
-    <w:lsdException w:name="HTML Code" w:semiHidden="1" w:unhideWhenUsed="1"/>
-    <w:lsdException w:name="HTML Definition" w:semiHidden="1" w:unhideWhenUsed="1"/>
-    <w:lsdException w:name="HTML Keyboard" w:semiHidden="1" w:unhideWhenUsed="1"/>
-    <w:lsdException w:name="HTML Preformatted" w:semiHidden="1" w:unhideWhenUsed="1"/>
-    <w:lsdException w:name="HTML Sample" w:semiHidden="1" w:unhideWhenUsed="1"/>
-    <w:lsdException w:name="HTML Typewriter" w:semiHidden="1" w:unhideWhenUsed="1"/>
-    <w:lsdException w:name="HTML Variable" w:semiHidden="1" w:unhideWhenUsed="1"/>
-    <w:lsdException w:name="Normal Table" w:semiHidden="1" w:unhideWhenUsed="1"/>
-    <w:lsdException w:name="annotation subject" w:semiHidden="1" w:unhideWhenUsed="1"/>
-    <w:lsdException w:name="No List" w:semiHidden="1" w:unhideWhenUsed="1"/>
-    <w:lsdException w:name="Outline List 1" w:semiHidden="1" w:unhideWhenUsed="1"/>
-    <w:lsdException w:name="Outline List 2" w:semiHidden="1" w:unhideWhenUsed="1"/>
-    <w:lsdException w:name="Outline List 3" w:semiHidden="1" w:unhideWhenUsed="1"/>
-    <w:lsdException w:name="Table Simple 1" w:semiHidden="1" w:unhideWhenUsed="1"/>
-    <w:lsdException w:name="Table Simple 2" w:semiHidden="1" w:unhideWhenUsed="1"/>
-    <w:lsdException w:name="Table Simple 3" w:semiHidden="1" w:unhideWhenUsed="1"/>
-    <w:lsdException w:name="Table Classic 1" w:semiHidden="1" w:unhideWhenUsed="1"/>
-    <w:lsdException w:name="Table Classic 2" w:semiHidden="1" w:unhideWhenUsed="1"/>
-    <w:lsdException w:name="Table Classic 3" w:semiHidden="1" w:unhideWhenUsed="1"/>
-    <w:lsdException w:name="Table Classic 4" w:semiHidden="1" w:unhideWhenUsed="1"/>
-    <w:lsdException w:name="Table Colorful 1" w:semiHidden="1" w:unhideWhenUsed="1"/>
-    <w:lsdException w:name="Table Colorful 2" w:semiHidden="1" w:unhideWhenUsed="1"/>
-    <w:lsdException w:name="Table Colorful 3" w:semiHidden="1" w:unhideWhenUsed="1"/>
-    <w:lsdException w:name="Table Columns 1" w:semiHidden="1" w:unhideWhenUsed="1"/>
-    <w:lsdException w:name="Table Columns 2" w:semiHidden="1" w:unhideWhenUsed="1"/>
-    <w:lsdException w:name="Table Columns 3" w:semiHidden="1" w:unhideWhenUsed="1"/>
-    <w:lsdException w:name="Table Columns 4" w:semiHidden="1" w:unhideWhenUsed="1"/>
-    <w:lsdException w:name="Table Columns 5" w:semiHidden="1" w:unhideWhenUsed="1"/>
-    <w:lsdException w:name="Table Grid 1" w:semiHidden="1" w:unhideWhenUsed="1"/>
-    <w:lsdException w:name="Table Grid 2" w:semiHidden="1" w:unhideWhenUsed="1"/>
-    <w:lsdException w:name="Table Grid 3" w:semiHidden="1" w:unhideWhenUsed="1"/>
-    <w:lsdException w:name="Table Grid 4" w:semiHidden="1" w:unhideWhenUsed="1"/>
-    <w:lsdException w:name="Table Grid 5" w:semiHidden="1" w:unhideWhenUsed="1"/>
-    <w:lsdException w:name="Table Grid 6" w:semiHidden="1" w:unhideWhenUsed="1"/>
-    <w:lsdException w:name="Table Grid 7" w:semiHidden="1" w:unhideWhenUsed="1"/>
-    <w:lsdException w:name="Table Grid 8" w:semiHidden="1" w:unhideWhenUsed="1"/>
-    <w:lsdException w:name="Table List 1" w:semiHidden="1" w:unhideWhenUsed="1"/>
-    <w:lsdException w:name="Table List 2" w:semiHidden="1" w:unhideWhenUsed="1"/>
-    <w:lsdException w:name="Table List 3" w:semiHidden="1" w:unhideWhenUsed="1"/>
-    <w:lsdException w:name="Table List 4" w:semiHidden="1" w:unhideWhenUsed="1"/>
-    <w:lsdException w:name="Table List 5" w:semiHidden="1" w:unhideWhenUsed="1"/>
-    <w:lsdException w:name="Table List 6" w:semiHidden="1" w:unhideWhenUsed="1"/>
-    <w:lsdException w:name="Table List 7" w:semiHidden="1" w:unhideWhenUsed="1"/>
-    <w:lsdException w:name="Table List 8" w:semiHidden="1" w:unhideWhenUsed="1"/>
-    <w:lsdException w:name="Table 3D effects 1" w:semiHidden="1" w:unhideWhenUsed="1"/>
-    <w:lsdException w:name="Table 3D effects 2" w:semiHidden="1" w:unhideWhenUsed="1"/>
-    <w:lsdException w:name="Table 3D effects 3" w:semiHidden="1" w:unhideWhenUsed="1"/>
-    <w:lsdException w:name="Table Contemporary" w:semiHidden="1" w:unhideWhenUsed="1"/>
-    <w:lsdException w:name="Table Elegant" w:semiHidden="1" w:unhideWhenUsed="1"/>
-    <w:lsdException w:name="Table Professional" w:semiHidden="1" w:unhideWhenUsed="1"/>
-    <w:lsdException w:name="Table Subtle 1" w:semiHidden="1" w:unhideWhenUsed="1"/>
-    <w:lsdException w:name="Table Subtle 2" w:semiHidden="1" w:unhideWhenUsed="1"/>
-    <w:lsdException w:name="Table Web 1" w:semiHidden="1" w:unhideWhenUsed="1"/>
-    <w:lsdException w:name="Table Web 2" w:semiHidden="1" w:unhideWhenUsed="1"/>
-    <w:lsdException w:name="Table Web 3" w:semiHidden="1" w:unhideWhenUsed="1"/>
-    <w:lsdException w:name="Balloon Text" w:semiHidden="1" w:unhideWhenUsed="1"/>
-    <w:lsdException w:name="Table Grid" w:uiPriority="39"/>
-    <w:lsdException w:name="Table Theme" w:semiHidden="1" w:unhideWhenUsed="1"/>
-    <w:lsdException w:name="Placeholder Text" w:semiHidden="1"/>
-    <w:lsdException w:name="No Spacing" w:uiPriority="1" w:qFormat="1"/>
-    <w:lsdException w:name="Light Shading" w:uiPriority="60"/>
-    <w:lsdException w:name="Light List" w:uiPriority="61"/>
-    <w:lsdException w:name="Light Grid" w:uiPriority="62"/>
-    <w:lsdException w:name="Medium Shading 1" w:uiPriority="63"/>
-    <w:lsdException w:name="Medium Shading 2" w:uiPriority="64"/>
-    <w:lsdException w:name="Medium List 1" w:uiPriority="65"/>
-    <w:lsdException w:name="Medium List 2" w:uiPriority="66"/>
-    <w:lsdException w:name="Medium Grid 1" w:uiPriority="67"/>
-    <w:lsdException w:name="Medium Grid 2" w:uiPriority="68"/>
-    <w:lsdException w:name="Medium Grid 3" w:uiPriority="69"/>
-    <w:lsdException w:name="Dark List" w:uiPriority="70"/>
-    <w:lsdException w:name="Colorful Shading" w:uiPriority="71"/>
-    <w:lsdException w:name="Colorful List" w:uiPriority="72"/>
-    <w:lsdException w:name="Colorful Grid" w:uiPriority="73"/>
-    <w:lsdException w:name="Light Shading Accent 1" w:uiPriority="60"/>
-    <w:lsdException w:name="Light List Accent 1" w:uiPriority="61"/>
-    <w:lsdException w:name="Light Grid Accent 1" w:uiPriority="62"/>
-    <w:lsdException w:name="Medium Shading 1 Accent 1" w:uiPriority="63"/>
-    <w:lsdException w:name="Medium Shading 2 Accent 1" w:uiPriority="64"/>
-    <w:lsdException w:name="Medium List 1 Accent 1" w:uiPriority="65"/>
-    <w:lsdException w:name="Revision" w:semiHidden="1"/>
-    <w:lsdException w:name="List Paragraph" w:uiPriority="34" w:qFormat="1"/>
-    <w:lsdException w:name="Quote" w:uiPriority="29" w:qFormat="1"/>
-    <w:lsdException w:name="Intense Quote" w:uiPriority="30" w:qFormat="1"/>
-    <w:lsdException w:name="Medium List 2 Accent 1" w:uiPriority="66"/>
-    <w:lsdException w:name="Medium Grid 1 Accent 1" w:uiPriority="67"/>
-    <w:lsdException w:name="Medium Grid 2 Accent 1" w:uiPriority="68"/>
-    <w:lsdException w:name="Medium Grid 3 Accent 1" w:uiPriority="69"/>
-    <w:lsdException w:name="Dark List Accent 1" w:uiPriority="70"/>
-    <w:lsdException w:name="Colorful Shading Accent 1" w:uiPriority="71"/>
-    <w:lsdException w:name="Colorful List Accent 1" w:uiPriority="72"/>
-    <w:lsdException w:name="Colorful Grid Accent 1" w:uiPriority="73"/>
-    <w:lsdException w:name="Light Shading Accent 2" w:uiPriority="60"/>
-    <w:lsdException w:name="Light List Accent 2" w:uiPriority="61"/>
-    <w:lsdException w:name="Light Grid Accent 2" w:uiPriority="62"/>
-    <w:lsdException w:name="Medium Shading 1 Accent 2" w:uiPriority="63"/>
-    <w:lsdException w:name="Medium Shading 2 Accent 2" w:uiPriority="64"/>
-    <w:lsdException w:name="Medium List 1 Accent 2" w:uiPriority="65"/>
-    <w:lsdException w:name="Medium List 2 Accent 2" w:uiPriority="66"/>
-    <w:lsdException w:name="Medium Grid 1 Accent 2" w:uiPriority="67"/>
-    <w:lsdException w:name="Medium Grid 2 Accent 2" w:uiPriority="68"/>
-    <w:lsdException w:name="Medium Grid 3 Accent 2" w:uiPriority="69"/>
-    <w:lsdException w:name="Dark List Accent 2" w:uiPriority="70"/>
-    <w:lsdException w:name="Colorful Shading Accent 2" w:uiPriority="71"/>
-    <w:lsdException w:name="Colorful List Accent 2" w:uiPriority="72"/>
-    <w:lsdException w:name="Colorful Grid Accent 2" w:uiPriority="73"/>
-    <w:lsdException w:name="Light Shading Accent 3" w:uiPriority="60"/>
-    <w:lsdException w:name="Light List Accent 3" w:uiPriority="61"/>
-    <w:lsdException w:name="Light Grid Accent 3" w:uiPriority="62"/>
-    <w:lsdException w:name="Medium Shading 1 Accent 3" w:uiPriority="63"/>
-    <w:lsdException w:name="Medium Shading 2 Accent 3" w:uiPriority="64"/>
-    <w:lsdException w:name="Medium List 1 Accent 3" w:uiPriority="65"/>
-    <w:lsdException w:name="Medium List 2 Accent 3" w:uiPriority="66"/>
-    <w:lsdException w:name="Medium Grid 1 Accent 3" w:uiPriority="67"/>
-    <w:lsdException w:name="Medium Grid 2 Accent 3" w:uiPriority="68"/>
-    <w:lsdException w:name="Medium Grid 3 Accent 3" w:uiPriority="69"/>
-    <w:lsdException w:name="Dark List Accent 3" w:uiPriority="70"/>
-    <w:lsdException w:name="Colorful Shading Accent 3" w:uiPriority="71"/>
-    <w:lsdException w:name="Colorful List Accent 3" w:uiPriority="72"/>
-    <w:lsdException w:name="Colorful Grid Accent 3" w:uiPriority="73"/>
-    <w:lsdException w:name="Light Shading Accent 4" w:uiPriority="60"/>
-    <w:lsdException w:name="Light List Accent 4" w:uiPriority="61"/>
-    <w:lsdException w:name="Light Grid Accent 4" w:uiPriority="62"/>
-    <w:lsdException w:name="Medium Shading 1 Accent 4" w:uiPriority="63"/>
-    <w:lsdException w:name="Medium Shading 2 Accent 4" w:uiPriority="64"/>
-    <w:lsdException w:name="Medium List 1 Accent 4" w:uiPriority="65"/>
-    <w:lsdException w:name="Medium List 2 Accent 4" w:uiPriority="66"/>
-    <w:lsdException w:name="Medium Grid 1 Accent 4" w:uiPriority="67"/>
-    <w:lsdException w:name="Medium Grid 2 Accent 4" w:uiPriority="68"/>
-    <w:lsdException w:name="Medium Grid 3 Accent 4" w:uiPriority="69"/>
-    <w:lsdException w:name="Dark List Accent 4" w:uiPriority="70"/>
-    <w:lsdException w:name="Colorful Shading Accent 4" w:uiPriority="71"/>
-    <w:lsdException w:name="Colorful List Accent 4" w:uiPriority="72"/>
-    <w:lsdException w:name="Colorful Grid Accent 4" w:uiPriority="73"/>
-    <w:lsdException w:name="Light Shading Accent 5" w:uiPriority="60"/>
-    <w:lsdException w:name="Light List Accent 5" w:uiPriority="61"/>
-    <w:lsdException w:name="Light Grid Accent 5" w:uiPriority="62"/>
-    <w:lsdException w:name="Medium Shading 1 Accent 5" w:uiPriority="63"/>
-    <w:lsdException w:name="Medium Shading 2 Accent 5" w:uiPriority="64"/>
-    <w:lsdException w:name="Medium List 1 Accent 5" w:uiPriority="65"/>
-    <w:lsdException w:name="Medium List 2 Accent 5" w:uiPriority="66"/>
-    <w:lsdException w:name="Medium Grid 1 Accent 5" w:uiPriority="67"/>
-    <w:lsdException w:name="Medium Grid 2 Accent 5" w:uiPriority="68"/>
-    <w:lsdException w:name="Medium Grid 3 Accent 5" w:uiPriority="69"/>
-    <w:lsdException w:name="Dark List Accent 5" w:uiPriority="70"/>
-    <w:lsdException w:name="Colorful Shading Accent 5" w:uiPriority="71"/>
-    <w:lsdException w:name="Colorful List Accent 5" w:uiPriority="72"/>
-    <w:lsdException w:name="Colorful Grid Accent 5" w:uiPriority="73"/>
-    <w:lsdException w:name="Light Shading Accent 6" w:uiPriority="60"/>
-    <w:lsdException w:name="Light List Accent 6" w:uiPriority="61"/>
-    <w:lsdException w:name="Light Grid Accent 6" w:uiPriority="62"/>
-    <w:lsdException w:name="Medium Shading 1 Accent 6" w:uiPriority="63"/>
-    <w:lsdException w:name="Medium Shading 2 Accent 6" w:uiPriority="64"/>
-    <w:lsdException w:name="Medium List 1 Accent 6" w:uiPriority="65"/>
-    <w:lsdException w:name="Medium List 2 Accent 6" w:uiPriority="66"/>
-    <w:lsdException w:name="Medium Grid 1 Accent 6" w:uiPriority="67"/>
-    <w:lsdException w:name="Medium Grid 2 Accent 6" w:uiPriority="68"/>
-    <w:lsdException w:name="Medium Grid 3 Accent 6" w:uiPriority="69"/>
-    <w:lsdException w:name="Dark List Accent 6" w:uiPriority="70"/>
-    <w:lsdException w:name="Colorful Shading Accent 6" w:uiPriority="71"/>
-    <w:lsdException w:name="Colorful List Accent 6" w:uiPriority="72"/>
-    <w:lsdException w:name="Colorful Grid Accent 6" w:uiPriority="73"/>
-    <w:lsdException w:name="Subtle Emphasis" w:uiPriority="19" w:qFormat="1"/>
-    <w:lsdException w:name="Intense Emphasis" w:uiPriority="21" w:qFormat="1"/>
-    <w:lsdException w:name="Subtle Reference" w:uiPriority="31" w:qFormat="1"/>
-    <w:lsdException w:name="Intense Reference" w:uiPriority="32" w:qFormat="1"/>
-    <w:lsdException w:name="Book Title" w:uiPriority="33" w:qFormat="1"/>
-    <w:lsdException w:name="Bibliography" w:semiHidden="1" w:uiPriority="37" w:unhideWhenUsed="1"/>
-    <w:lsdException w:name="TOC Heading" w:semiHidden="1" w:uiPriority="39" w:unhideWhenUsed="1" w:qFormat="1"/>
-    <w:lsdException w:name="Plain Table 1" w:uiPriority="41"/>
-    <w:lsdException w:name="Plain Table 2" w:uiPriority="42"/>
-    <w:lsdException w:name="Plain Table 3" w:uiPriority="43"/>
-    <w:lsdException w:name="Plain Table 4" w:uiPriority="44"/>
-    <w:lsdException w:name="Plain Table 5" w:uiPriority="45"/>
-    <w:lsdException w:name="Grid Table Light" w:uiPriority="40"/>
-    <w:lsdException w:name="Grid Table 1 Light" w:uiPriority="46"/>
-    <w:lsdException w:name="Grid Table 2" w:uiPriority="47"/>
-    <w:lsdException w:name="Grid Table 3" w:uiPriority="48"/>
-    <w:lsdException w:name="Grid Table 4" w:uiPriority="49"/>
-    <w:lsdException w:name="Grid Table 5 Dark" w:uiPriority="50"/>
-    <w:lsdException w:name="Grid Table 6 Colorful" w:uiPriority="51"/>
-    <w:lsdException w:name="Grid Table 7 Colorful" w:uiPriority="52"/>
-    <w:lsdException w:name="Grid Table 1 Light Accent 1" w:uiPriority="46"/>
-    <w:lsdException w:name="Grid Table 2 Accent 1" w:uiPriority="47"/>
-    <w:lsdException w:name="Grid Table 3 Accent 1" w:uiPriority="48"/>
-    <w:lsdException w:name="Grid Table 4 Accent 1" w:uiPriority="49"/>
-    <w:lsdException w:name="Grid Table 5 Dark Accent 1" w:uiPriority="50"/>
-    <w:lsdException w:name="Grid Table 6 Colorful Accent 1" w:uiPriority="51"/>
-    <w:lsdException w:name="Grid Table 7 Colorful Accent 1" w:uiPriority="52"/>
-    <w:lsdException w:name="Grid Table 1 Light Accent 2" w:uiPriority="46"/>
-    <w:lsdException w:name="Grid Table 2 Accent 2" w:uiPriority="47"/>
-    <w:lsdException w:name="Grid Table 3 Accent 2" w:uiPriority="48"/>
-    <w:lsdException w:name="Grid Table 4 Accent 2" w:uiPriority="49"/>
-    <w:lsdException w:name="Grid Table 5 Dark Accent 2" w:uiPriority="50"/>
-    <w:lsdException w:name="Grid Table 6 Colorful Accent 2" w:uiPriority="51"/>
-    <w:lsdException w:name="Grid Table 7 Colorful Accent 2" w:uiPriority="52"/>
-    <w:lsdException w:name="Grid Table 1 Light Accent 3" w:uiPriority="46"/>
-    <w:lsdException w:name="Grid Table 2 Accent 3" w:uiPriority="47"/>
-    <w:lsdException w:name="Grid Table 3 Accent 3" w:uiPriority="48"/>
-    <w:lsdException w:name="Grid Table 4 Accent 3" w:uiPriority="49"/>
-    <w:lsdException w:name="Grid Table 5 Dark Accent 3" w:uiPriority="50"/>
-    <w:lsdException w:name="Grid Table 6 Colorful Accent 3" w:uiPriority="51"/>
-    <w:lsdException w:name="Grid Table 7 Colorful Accent 3" w:uiPriority="52"/>
-    <w:lsdException w:name="Grid Table 1 Light Accent 4" w:uiPriority="46"/>
-    <w:lsdException w:name="Grid Table 2 Accent 4" w:uiPriority="47"/>
-    <w:lsdException w:name="Grid Table 3 Accent 4" w:uiPriority="48"/>
-    <w:lsdException w:name="Grid Table 4 Accent 4" w:uiPriority="49"/>
-    <w:lsdException w:name="Grid Table 5 Dark Accent 4" w:uiPriority="50"/>
-    <w:lsdException w:name="Grid Table 6 Colorful Accent 4" w:uiPriority="51"/>
-    <w:lsdException w:name="Grid Table 7 Colorful Accent 4" w:uiPriority="52"/>
-    <w:lsdException w:name="Grid Table 1 Light Accent 5" w:uiPriority="46"/>
-    <w:lsdException w:name="Grid Table 2 Accent 5" w:uiPriority="47"/>
-    <w:lsdException w:name="Grid Table 3 Accent 5" w:uiPriority="48"/>
-    <w:lsdException w:name="Grid Table 4 Accent 5" w:uiPriority="49"/>
-    <w:lsdException w:name="Grid Table 5 Dark Accent 5" w:uiPriority="50"/>
-    <w:lsdException w:name="Grid Table 6 Colorful Accent 5" w:uiPriority="51"/>
-    <w:lsdException w:name="Grid Table 7 Colorful Accent 5" w:uiPriority="52"/>
-    <w:lsdException w:name="Grid Table 1 Light Accent 6" w:uiPriority="46"/>
-    <w:lsdException w:name="Grid Table 2 Accent 6" w:uiPriority="47"/>
-    <w:lsdException w:name="Grid Table 3 Accent 6" w:uiPriority="48"/>
-    <w:lsdException w:name="Grid Table 4 Accent 6" w:uiPriority="49"/>
-    <w:lsdException w:name="Grid Table 5 Dark Accent 6" w:uiPriority="50"/>
-    <w:lsdException w:name="Grid Table 6 Colorful Accent 6" w:uiPriority="51"/>
-    <w:lsdException w:name="Grid Table 7 Colorful Accent 6" w:uiPriority="52"/>
-    <w:lsdException w:name="List Table 1 Light" w:uiPriority="46"/>
-    <w:lsdException w:name="List Table 2" w:uiPriority="47"/>
-    <w:lsdException w:name="List Table 3" w:uiPriority="48"/>
-    <w:lsdException w:name="List Table 4" w:uiPriority="49"/>
-    <w:lsdException w:name="List Table 5 Dark" w:uiPriority="50"/>
-    <w:lsdException w:name="List Table 6 Colorful" w:uiPriority="51"/>
-    <w:lsdException w:name="List Table 7 Colorful" w:uiPriority="52"/>
-    <w:lsdException w:name="List Table 1 Light Accent 1" w:uiPriority="46"/>
-    <w:lsdException w:name="List Table 2 Accent 1" w:uiPriority="47"/>
-    <w:lsdException w:name="List Table 3 Accent 1" w:uiPriority="48"/>
-    <w:lsdException w:name="List Table 4 Accent 1" w:uiPriority="49"/>
-    <w:lsdException w:name="List Table 5 Dark Accent 1" w:uiPriority="50"/>
-    <w:lsdException w:name="List Table 6 Colorful Accent 1" w:uiPriority="51"/>
-    <w:lsdException w:name="List Table 7 Colorful Accent 1" w:uiPriority="52"/>
-    <w:lsdException w:name="List Table 1 Light Accent 2" w:uiPriority="46"/>
-    <w:lsdException w:name="List Table 2 Accent 2" w:uiPriority="47"/>
-    <w:lsdException w:name="List Table 3 Accent 2" w:uiPriority="48"/>
-    <w:lsdException w:name="List Table 4 Accent 2" w:uiPriority="49"/>
-    <w:lsdException w:name="List Table 5 Dark Accent 2" w:uiPriority="50"/>
-    <w:lsdException w:name="List Table 6 Colorful Accent 2" w:uiPriority="51"/>
-    <w:lsdException w:name="List Table 7 Colorful Accent 2" w:uiPriority="52"/>
-    <w:lsdException w:name="List Table 1 Light Accent 3" w:uiPriority="46"/>
-    <w:lsdException w:name="List Table 2 Accent 3" w:uiPriority="47"/>
-    <w:lsdException w:name="List Table 3 Accent 3" w:uiPriority="48"/>
-    <w:lsdException w:name="List Table 4 Accent 3" w:uiPriority="49"/>
-    <w:lsdException w:name="List Table 5 Dark Accent 3" w:uiPriority="50"/>
-    <w:lsdException w:name="List Table 6 Colorful Accent 3" w:uiPriority="51"/>
-    <w:lsdException w:name="List Table 7 Colorful Accent 3" w:uiPriority="52"/>
-    <w:lsdException w:name="List Table 1 Light Accent 4" w:uiPriority="46"/>
-    <w:lsdException w:name="List Table 2 Accent 4" w:uiPriority="47"/>
-    <w:lsdException w:name="List Table 3 Accent 4" w:uiPriority="48"/>
-    <w:lsdException w:name="List Table 4 Accent 4" w:uiPriority="49"/>
-    <w:lsdException w:name="List Table 5 Dark Accent 4" w:uiPriority="50"/>
-    <w:lsdException w:name="List Table 6 Colorful Accent 4" w:uiPriority="51"/>
-    <w:lsdException w:name="List Table 7 Colorful Accent 4" w:uiPriority="52"/>
-    <w:lsdException w:name="List Table 1 Light Accent 5" w:uiPriority="46"/>
-    <w:lsdException w:name="List Table 2 Accent 5" w:uiPriority="47"/>
-    <w:lsdException w:name="List Table 3 Accent 5" w:uiPriority="48"/>
-    <w:lsdException w:name="List Table 4 Accent 5" w:uiPriority="49"/>
-    <w:lsdException w:name="List Table 5 Dark Accent 5" w:uiPriority="50"/>
-    <w:lsdException w:name="List Table 6 Colorful Accent 5" w:uiPriority="51"/>
-    <w:lsdException w:name="List Table 7 Colorful Accent 5" w:uiPriority="52"/>
-    <w:lsdException w:name="List Table 1 Light Accent 6" w:uiPriority="46"/>
-    <w:lsdException w:name="List Table 2 Accent 6" w:uiPriority="47"/>
-    <w:lsdException w:name="List Table 3 Accent 6" w:uiPriority="48"/>
-    <w:lsdException w:name="List Table 4 Accent 6" w:uiPriority="49"/>
-    <w:lsdException w:name="List Table 5 Dark Accent 6" w:uiPriority="50"/>
-    <w:lsdException w:name="List Table 6 Colorful Accent 6" w:uiPriority="51"/>
-    <w:lsdException w:name="List Table 7 Colorful Accent 6" w:uiPriority="52"/>
-    <w:lsdException w:name="Mention" w:semiHidden="1" w:unhideWhenUsed="1"/>
-    <w:lsdException w:name="Smart Hyperlink" w:semiHidden="1" w:unhideWhenUsed="1"/>
-    <w:lsdException w:name="Hashtag" w:semiHidden="1" w:unhideWhenUsed="1"/>
-    <w:lsdException w:name="Unresolved Mention" w:semiHidden="1" w:unhideWhenUsed="1"/>
-    <w:lsdException w:name="Smart Link" w:semiHidden="1" w:unhideWhenUsed="1"/>
-  </w:latentStyles>
-  <w:style w:type="paragraph" w:default="1" w:styleId="Normal">
-    <w:name w:val="Normal"/>
-    <w:qFormat/>
-  </w:style>
-  <w:style w:type="paragraph" w:styleId="Ttulo1">
-    <w:name w:val="heading 1"/>
-    <w:uiPriority w:val="9"/>
-    <w:qFormat/>
-    <w:pPr>
-      <w:spacing w:before="240" w:after="240"/>
-      <w:outlineLvl w:val="0"/>
-    </w:pPr>
-    <w:rPr>
-      <w:b/>
-      <w:bCs/>
-      <w:color w:val="000000"/>
-    </w:rPr>
-  </w:style>
-  <w:style w:type="paragraph" w:styleId="Ttulo2">
-    <w:name w:val="heading 2"/>
-    <w:uiPriority w:val="9"/>
-    <w:unhideWhenUsed/>
-    <w:qFormat/>
-    <w:pPr>
-      <w:spacing w:before="240" w:after="120"/>
-      <w:outlineLvl w:val="1"/>
-    </w:pPr>
-    <w:rPr>
-      <w:b/>
-      <w:bCs/>
-      <w:color w:val="000000"/>
-    </w:rPr>
-  </w:style>
-  <w:style w:type="paragraph" w:styleId="Ttulo3">
-    <w:name w:val="heading 3"/>
-    <w:uiPriority w:val="9"/>
-    <w:unhideWhenUsed/>
-    <w:qFormat/>
-    <w:pPr>
-      <w:spacing w:before="180" w:after="120"/>
-      <w:outlineLvl w:val="2"/>
-    </w:pPr>
-    <w:rPr>
-      <w:b/>
-      <w:bCs/>
-      <w:color w:val="000000"/>
-    </w:rPr>
-  </w:style>
-  <w:style w:type="paragraph" w:styleId="Ttulo4">
-    <w:name w:val="heading 4"/>
-    <w:uiPriority w:val="9"/>
-    <w:semiHidden/>
-    <w:unhideWhenUsed/>
-    <w:qFormat/>
-    <w:pPr>
-      <w:outlineLvl w:val="3"/>
-    </w:pPr>
-    <w:rPr>
-      <w:i/>
-      <w:iCs/>
-      <w:color w:val="2E74B5"/>
-    </w:rPr>
-  </w:style>
-  <w:style w:type="paragraph" w:styleId="Ttulo5">
-    <w:name w:val="heading 5"/>
-    <w:uiPriority w:val="9"/>
-    <w:semiHidden/>
-    <w:unhideWhenUsed/>
-    <w:qFormat/>
-    <w:pPr>
-      <w:outlineLvl w:val="4"/>
-    </w:pPr>
-    <w:rPr>
-      <w:color w:val="2E74B5"/>
-    </w:rPr>
-  </w:style>
-  <w:style w:type="paragraph" w:styleId="Ttulo6">
-    <w:name w:val="heading 6"/>
-    <w:uiPriority w:val="9"/>
-    <w:semiHidden/>
-    <w:unhideWhenUsed/>
-    <w:qFormat/>
-    <w:pPr>
-      <w:outlineLvl w:val="5"/>
-    </w:pPr>
-    <w:rPr>
-      <w:color w:val="1F4D78"/>
-    </w:rPr>
-  </w:style>
-  <w:style w:type="character" w:default="1" w:styleId="Fontepargpadro">
-    <w:name w:val="Default Paragraph Font"/>
-    <w:uiPriority w:val="1"/>
-    <w:semiHidden/>
-    <w:unhideWhenUsed/>
-  </w:style>
-  <w:style w:type="table" w:default="1" w:styleId="Tabelanormal">
-    <w:name w:val="Normal Table"/>
-    <w:uiPriority w:val="99"/>
-    <w:semiHidden/>
-    <w:unhideWhenUsed/>
-    <w:tblPr>
-      <w:tblInd w:w="0" w:type="dxa"/>
-      <w:tblCellMar>
-        <w:top w:w="0" w:type="dxa"/>
-        <w:left w:w="108" w:type="dxa"/>
-        <w:bottom w:w="0" w:type="dxa"/>
-        <w:right w:w="108" w:type="dxa"/>
-      </w:tblCellMar>
-    </w:tblPr>
-  </w:style>
-  <w:style w:type="numbering" w:default="1" w:styleId="Semlista">
-    <w:name w:val="No List"/>
-    <w:uiPriority w:val="99"/>
-    <w:semiHidden/>
-    <w:unhideWhenUsed/>
-  </w:style>
-  <w:style w:type="paragraph" w:styleId="Ttulo">
-    <w:name w:val="Title"/>
-    <w:uiPriority w:val="10"/>
-    <w:qFormat/>
-    <w:rPr>
-      <w:sz w:val="56"/>
-      <w:szCs w:val="56"/>
-    </w:rPr>
-  </w:style>
-  <w:style w:type="paragraph" w:customStyle="1" w:styleId="Forte1">
-    <w:name w:val="Forte1"/>
-    <w:qFormat/>
-    <w:rPr>
-      <w:b/>
-      <w:bCs/>
-    </w:rPr>
-  </w:style>
-  <w:style w:type="paragraph" w:styleId="PargrafodaLista">
-    <w:name w:val="List Paragraph"/>
-    <w:qFormat/>
-  </w:style>
-  <w:style w:type="character" w:styleId="Hyperlink">
-    <w:name w:val="Hyperlink"/>
-    <w:uiPriority w:val="99"/>
-    <w:unhideWhenUsed/>
-    <w:rPr>
-      <w:color w:val="0563C1"/>
-      <w:u w:val="single"/>
-    </w:rPr>
-  </w:style>
-  <w:style w:type="character" w:styleId="Refdenotaderodap">
-    <w:name w:val="footnote reference"/>
-    <w:uiPriority w:val="99"/>
-    <w:semiHidden/>
-    <w:unhideWhenUsed/>
-    <w:rPr>
-      <w:vertAlign w:val="superscript"/>
-    </w:rPr>
-  </w:style>
-  <w:style w:type="paragraph" w:styleId="Textodenotaderodap">
-    <w:name w:val="footnote text"/>
-    <w:link w:val="TextodenotaderodapChar"/>
-    <w:uiPriority w:val="99"/>
-    <w:semiHidden/>
-    <w:unhideWhenUsed/>
-    <w:rPr>
-      <w:sz w:val="20"/>
-      <w:szCs w:val="20"/>
-    </w:rPr>
-  </w:style>
-  <w:style w:type="character" w:customStyle="1" w:styleId="TextodenotaderodapChar">
-    <w:name w:val="Texto de nota de rodapé Char"/>
-    <w:link w:val="Textodenotaderodap"/>
-    <w:uiPriority w:val="99"/>
-    <w:semiHidden/>
-    <w:unhideWhenUsed/>
-    <w:rPr>
-      <w:sz w:val="20"/>
-      <w:szCs w:val="20"/>
-    </w:rPr>
-  </w:style>
-  <w:style w:type="character" w:styleId="Refdenotadefim">
-    <w:name w:val="endnote reference"/>
-    <w:uiPriority w:val="99"/>
-    <w:semiHidden/>
-    <w:unhideWhenUsed/>
-    <w:rPr>
-      <w:vertAlign w:val="superscript"/>
-    </w:rPr>
-  </w:style>
-  <w:style w:type="paragraph" w:styleId="Textodenotadefim">
-    <w:name w:val="endnote text"/>
-    <w:link w:val="TextodenotadefimChar"/>
-    <w:uiPriority w:val="99"/>
-    <w:semiHidden/>
-    <w:unhideWhenUsed/>
-    <w:rPr>
-      <w:sz w:val="20"/>
-      <w:szCs w:val="20"/>
-    </w:rPr>
-  </w:style>
-  <w:style w:type="character" w:customStyle="1" w:styleId="TextodenotadefimChar">
-    <w:name w:val="Texto de nota de fim Char"/>
-    <w:link w:val="Textodenotadefim"/>
-    <w:uiPriority w:val="99"/>
-    <w:semiHidden/>
-    <w:unhideWhenUsed/>
-    <w:rPr>
-      <w:sz w:val="20"/>
-      <w:szCs w:val="20"/>
-    </w:rPr>
-  </w:style>
-  <w:style w:type="paragraph" w:styleId="Sumrio1">
-    <w:name w:val="toc 1"/>
-    <w:basedOn w:val="Normal"/>
-    <w:next w:val="Normal"/>
-    <w:autoRedefine/>
-    <w:uiPriority w:val="39"/>
-    <w:unhideWhenUsed/>
-    <w:rsid w:val="00933254"/>
-    <w:pPr>
-      <w:spacing w:after="100"/>
-    </w:pPr>
-  </w:style>
-  <w:style w:type="paragraph" w:styleId="Sumrio2">
-    <w:name w:val="toc 2"/>
-    <w:basedOn w:val="Normal"/>
-    <w:next w:val="Normal"/>
-    <w:autoRedefine/>
-    <w:uiPriority w:val="39"/>
-    <w:unhideWhenUsed/>
-    <w:rsid w:val="00933254"/>
-    <w:pPr>
-      <w:spacing w:after="100"/>
-      <w:ind w:left="240"/>
-    </w:pPr>
-  </w:style>
-  <w:style w:type="paragraph" w:styleId="Sumrio3">
-    <w:name w:val="toc 3"/>
-    <w:basedOn w:val="Normal"/>
-    <w:next w:val="Normal"/>
-    <w:autoRedefine/>
-    <w:uiPriority w:val="39"/>
-    <w:unhideWhenUsed/>
-    <w:rsid w:val="00933254"/>
-    <w:pPr>
-      <w:spacing w:after="100"/>
-      <w:ind w:left="480"/>
-    </w:pPr>
-  </w:style>
-  <w:style w:type="paragraph" w:styleId="Cabealho">
-    <w:name w:val="header"/>
-    <w:basedOn w:val="Normal"/>
-    <w:link w:val="CabealhoChar"/>
-    <w:uiPriority w:val="99"/>
-    <w:unhideWhenUsed/>
-    <w:rsid w:val="005A4F9F"/>
-    <w:pPr>
-      <w:tabs>
-        <w:tab w:val="center" w:pos="4513"/>
-        <w:tab w:val="right" w:pos="9026"/>
-      </w:tabs>
-    </w:pPr>
-  </w:style>
-  <w:style w:type="character" w:customStyle="1" w:styleId="CabealhoChar">
-    <w:name w:val="Cabeçalho Char"/>
-    <w:basedOn w:val="Fontepargpadro"/>
-    <w:link w:val="Cabealho"/>
-    <w:uiPriority w:val="99"/>
-    <w:rsid w:val="005A4F9F"/>
-  </w:style>
-  <w:style w:type="paragraph" w:styleId="Rodap">
-    <w:name w:val="footer"/>
-    <w:basedOn w:val="Normal"/>
-    <w:link w:val="RodapChar"/>
-    <w:uiPriority w:val="99"/>
-    <w:unhideWhenUsed/>
-    <w:rsid w:val="005A4F9F"/>
-    <w:pPr>
-      <w:tabs>
-        <w:tab w:val="center" w:pos="4513"/>
-        <w:tab w:val="right" w:pos="9026"/>
-      </w:tabs>
-    </w:pPr>
-  </w:style>
-  <w:style w:type="character" w:customStyle="1" w:styleId="RodapChar">
-    <w:name w:val="Rodapé Char"/>
-    <w:basedOn w:val="Fontepargpadro"/>
-    <w:link w:val="Rodap"/>
-    <w:uiPriority w:val="99"/>
-    <w:rsid w:val="005A4F9F"/>
-  </w:style>
-</w:styles>
-</file>
-
-<file path=word/theme/theme1.xml><?xml version="1.0" encoding="utf-8"?>
-<a:theme xmlns:a="http://schemas.openxmlformats.org/drawingml/2006/main" name="Tema do Office">
-  <a:themeElements>
-    <a:clrScheme name="Office">
-      <a:dk1>
-        <a:sysClr val="windowText" lastClr="000000"/>
-      </a:dk1>
-      <a:lt1>
-        <a:sysClr val="window" lastClr="FFFFFF"/>
-      </a:lt1>
-      <a:dk2>
-        <a:srgbClr val="0E2841"/>
-      </a:dk2>
-      <a:lt2>
-        <a:srgbClr val="E8E8E8"/>
-      </a:lt2>
-      <a:accent1>
-        <a:srgbClr val="156082"/>
-      </a:accent1>
-      <a:accent2>
-        <a:srgbClr val="E97132"/>
-      </a:accent2>
-      <a:accent3>
-        <a:srgbClr val="196B24"/>
-      </a:accent3>
-      <a:accent4>
-        <a:srgbClr val="0F9ED5"/>
-      </a:accent4>
-      <a:accent5>
-        <a:srgbClr val="A02B93"/>
-      </a:accent5>
-      <a:accent6>
-        <a:srgbClr val="4EA72E"/>
-      </a:accent6>
-      <a:hlink>
-        <a:srgbClr val="467886"/>
-      </a:hlink>
-      <a:folHlink>
-        <a:srgbClr val="96607D"/>
-      </a:folHlink>
-    </a:clrScheme>
-    <a:fontScheme name="Office">
-      <a:majorFont>
-        <a:latin typeface="Aptos Display" panose="02110004020202020204"/>
-        <a:ea typeface=""/>
-        <a:cs typeface=""/>
-        <a:font script="Jpan" typeface="游ゴシック Light"/>
-        <a:font script="Hang" typeface="맑은 고딕"/>
-        <a:font script="Hans" typeface="等线 Light"/>
-        <a:font script="Hant" typeface="新細明體"/>
-        <a:font script="Arab" typeface="Times New Roman"/>
-        <a:font script="Hebr" typeface="Times New Roman"/>
-        <a:font script="Thai" typeface="Angsana New"/>
-        <a:font script="Ethi" typeface="Nyala"/>
-        <a:font script="Beng" typeface="Vrinda"/>
-        <a:font script="Gujr" typeface="Shruti"/>
-        <a:font script="Khmr" typeface="MoolBoran"/>
-        <a:font script="Knda" typeface="Tunga"/>
-        <a:font script="Guru" typeface="Raavi"/>
-        <a:font script="Cans" typeface="Euphemia"/>
-        <a:font script="Cher" typeface="Plantagenet Cherokee"/>
-        <a:font script="Yiii" typeface="Microsoft Yi Baiti"/>
-        <a:font script="Tibt" typeface="Microsoft Himalaya"/>
-        <a:font script="Thaa" typeface="MV Boli"/>
-        <a:font script="Deva" typeface="Mangal"/>
-        <a:font script="Telu" typeface="Gautami"/>
-        <a:font script="Taml" typeface="Latha"/>
-        <a:font script="Syrc" typeface="Estrangelo Edessa"/>
-        <a:font script="Orya" typeface="Kalinga"/>
-        <a:font script="Mlym" typeface="Kartika"/>
-        <a:font script="Laoo" typeface="DokChampa"/>
-        <a:font script="Sinh" typeface="Iskoola Pota"/>
-        <a:font script="Mong" typeface="Mongolian Baiti"/>
-        <a:font script="Viet" typeface="Times New Roman"/>
-        <a:font script="Uigh" typeface="Microsoft Uighur"/>
-        <a:font script="Geor" typeface="Sylfaen"/>
-        <a:font script="Armn" typeface="Arial"/>
-        <a:font script="Bugi" typeface="Leelawadee UI"/>
-        <a:font script="Bopo" typeface="Microsoft JhengHei"/>
-        <a:font script="Java" typeface="Javanese Text"/>
-        <a:font script="Lisu" typeface="Segoe UI"/>
-        <a:font script="Mymr" typeface="Myanmar Text"/>
-        <a:font script="Nkoo" typeface="Ebrima"/>
-        <a:font script="Olck" typeface="Nirmala UI"/>
-        <a:font script="Osma" typeface="Ebrima"/>
-        <a:font script="Phag" typeface="Phagspa"/>
-        <a:font script="Syrn" typeface="Estrangelo Edessa"/>
-        <a:font script="Syrj" typeface="Estrangelo Edessa"/>
-        <a:font script="Syre" typeface="Estrangelo Edessa"/>
-        <a:font script="Sora" typeface="Nirmala UI"/>
-        <a:font script="Tale" typeface="Microsoft Tai Le"/>
-        <a:font script="Talu" typeface="Microsoft New Tai Lue"/>
-        <a:font script="Tfng" typeface="Ebrima"/>
-      </a:majorFont>
-      <a:minorFont>
-        <a:latin typeface="Aptos" panose="02110004020202020204"/>
-        <a:ea typeface=""/>
-        <a:cs typeface=""/>
-        <a:font script="Jpan" typeface="游明朝"/>
-        <a:font script="Hang" typeface="맑은 고딕"/>
-        <a:font script="Hans" typeface="等线"/>
-        <a:font script="Hant" typeface="新細明體"/>
-        <a:font script="Arab" typeface="Arial"/>
-        <a:font script="Hebr" typeface="Arial"/>
-        <a:font script="Thai" typeface="Cordia New"/>
-        <a:font script="Ethi" typeface="Nyala"/>
-        <a:font script="Beng" typeface="Vrinda"/>
-        <a:font script="Gujr" typeface="Shruti"/>
-        <a:font script="Khmr" typeface="DaunPenh"/>
-        <a:font script="Knda" typeface="Tunga"/>
-        <a:font script="Guru" typeface="Raavi"/>
-        <a:font script="Cans" typeface="Euphemia"/>
-        <a:font script="Cher" typeface="Plantagenet Cherokee"/>
-        <a:font script="Yiii" typeface="Microsoft Yi Baiti"/>
-        <a:font script="Tibt" typeface="Microsoft Himalaya"/>
-        <a:font script="Thaa" typeface="MV Boli"/>
-        <a:font script="Deva" typeface="Mangal"/>
-        <a:font script="Telu" typeface="Gautami"/>
-        <a:font script="Taml" typeface="Latha"/>
-        <a:font script="Syrc" typeface="Estrangelo Edessa"/>
-        <a:font script="Orya" typeface="Kalinga"/>
-        <a:font script="Mlym" typeface="Kartika"/>
-        <a:font script="Laoo" typeface="DokChampa"/>
-        <a:font script="Sinh" typeface="Iskoola Pota"/>
-        <a:font script="Mong" typeface="Mongolian Baiti"/>
-        <a:font script="Viet" typeface="Arial"/>
-        <a:font script="Uigh" typeface="Microsoft Uighur"/>
-        <a:font script="Geor" typeface="Sylfaen"/>
-        <a:font script="Armn" typeface="Arial"/>
-        <a:font script="Bugi" typeface="Leelawadee UI"/>
-        <a:font script="Bopo" typeface="Microsoft JhengHei"/>
-        <a:font script="Java" typeface="Javanese Text"/>
-        <a:font script="Lisu" typeface="Segoe UI"/>
-        <a:font script="Mymr" typeface="Myanmar Text"/>
-        <a:font script="Nkoo" typeface="Ebrima"/>
-        <a:font script="Olck" typeface="Nirmala UI"/>
-        <a:font script="Osma" typeface="Ebrima"/>
-        <a:font script="Phag" typeface="Phagspa"/>
-        <a:font script="Syrn" typeface="Estrangelo Edessa"/>
-        <a:font script="Syrj" typeface="Estrangelo Edessa"/>
-        <a:font script="Syre" typeface="Estrangelo Edessa"/>
-        <a:font script="Sora" typeface="Nirmala UI"/>
-        <a:font script="Tale" typeface="Microsoft Tai Le"/>
-        <a:font script="Talu" typeface="Microsoft New Tai Lue"/>
-        <a:font script="Tfng" typeface="Ebrima"/>
-      </a:minorFont>
-    </a:fontScheme>
-    <a:fmtScheme name="Office">
-      <a:fillStyleLst>
-        <a:solidFill>
-          <a:schemeClr val="phClr"/>
-        </a:solidFill>
-        <a:gradFill rotWithShape="1">
-          <a:gsLst>
-            <a:gs pos="0">
-              <a:schemeClr val="phClr">
-                <a:lumMod val="110000"/>
-                <a:satMod val="105000"/>
-                <a:tint val="67000"/>
-              </a:schemeClr>
-            </a:gs>
-            <a:gs pos="50000">
-              <a:schemeClr val="phClr">
-                <a:lumMod val="105000"/>
-                <a:satMod val="103000"/>
-                <a:tint val="73000"/>
-              </a:schemeClr>
-            </a:gs>
-            <a:gs pos="100000">
-              <a:schemeClr val="phClr">
-                <a:lumMod val="105000"/>
-                <a:satMod val="109000"/>
-                <a:tint val="81000"/>
-              </a:schemeClr>
-            </a:gs>
-          </a:gsLst>
-          <a:lin ang="5400000" scaled="0"/>
-        </a:gradFill>
-        <a:gradFill rotWithShape="1">
-          <a:gsLst>
-            <a:gs pos="0">
-              <a:schemeClr val="phClr">
-                <a:satMod val="103000"/>
-                <a:lumMod val="102000"/>
-                <a:tint val="94000"/>
-              </a:schemeClr>
-            </a:gs>
-            <a:gs pos="50000">
-              <a:schemeClr val="phClr">
-                <a:satMod val="110000"/>
-                <a:lumMod val="100000"/>
-                <a:shade val="100000"/>
-              </a:schemeClr>
-            </a:gs>
-            <a:gs pos="100000">
-              <a:schemeClr val="phClr">
-                <a:lumMod val="99000"/>
-                <a:satMod val="120000"/>
-                <a:shade val="78000"/>
-              </a:schemeClr>
-            </a:gs>
-          </a:gsLst>
-          <a:lin ang="5400000" scaled="0"/>
-        </a:gradFill>
-      </a:fillStyleLst>
-      <a:lnStyleLst>
-        <a:ln w="12700" cap="flat" cmpd="sng" algn="ctr">
-          <a:solidFill>
-            <a:schemeClr val="phClr"/>
-          </a:solidFill>
-          <a:prstDash val="solid"/>
-          <a:miter lim="800000"/>
-        </a:ln>
-        <a:ln w="19050" cap="flat" cmpd="sng" algn="ctr">
-          <a:solidFill>
-            <a:schemeClr val="phClr"/>
-          </a:solidFill>
-          <a:prstDash val="solid"/>
-          <a:miter lim="800000"/>
-        </a:ln>
-        <a:ln w="25400" cap="flat" cmpd="sng" algn="ctr">
-          <a:solidFill>
-            <a:schemeClr val="phClr"/>
-          </a:solidFill>
-          <a:prstDash val="solid"/>
-          <a:miter lim="800000"/>
-        </a:ln>
-      </a:lnStyleLst>
-      <a:effectStyleLst>
-        <a:effectStyle>
-          <a:effectLst/>
-        </a:effectStyle>
-        <a:effectStyle>
-          <a:effectLst/>
-        </a:effectStyle>
-        <a:effectStyle>
-          <a:effectLst>
-            <a:outerShdw blurRad="57150" dist="19050" dir="5400000" algn="ctr" rotWithShape="0">
-              <a:srgbClr val="000000">
-                <a:alpha val="63000"/>
-              </a:srgbClr>
-            </a:outerShdw>
-          </a:effectLst>
-        </a:effectStyle>
-      </a:effectStyleLst>
-      <a:bgFillStyleLst>
-        <a:solidFill>
-          <a:schemeClr val="phClr"/>
-        </a:solidFill>
-        <a:solidFill>
-          <a:schemeClr val="phClr">
-            <a:tint val="95000"/>
-            <a:satMod val="170000"/>
-          </a:schemeClr>
-        </a:solidFill>
-        <a:gradFill rotWithShape="1">
-          <a:gsLst>
-            <a:gs pos="0">
-              <a:schemeClr val="phClr">
-                <a:tint val="93000"/>
-                <a:satMod val="150000"/>
-                <a:shade val="98000"/>
-                <a:lumMod val="102000"/>
-              </a:schemeClr>
-            </a:gs>
-            <a:gs pos="50000">
-              <a:schemeClr val="phClr">
-                <a:tint val="98000"/>
-                <a:satMod val="130000"/>
-                <a:shade val="90000"/>
-                <a:lumMod val="103000"/>
-              </a:schemeClr>
-            </a:gs>
-            <a:gs pos="100000">
-              <a:schemeClr val="phClr">
-                <a:shade val="63000"/>
-                <a:satMod val="120000"/>
-              </a:schemeClr>
-            </a:gs>
-          </a:gsLst>
-          <a:lin ang="5400000" scaled="0"/>
-        </a:gradFill>
-      </a:bgFillStyleLst>
-    </a:fmtScheme>
-  </a:themeElements>
-  <a:objectDefaults>
-    <a:lnDef>
-      <a:spPr/>
-      <a:bodyPr/>
-      <a:lstStyle/>
-      <a:style>
-        <a:lnRef idx="2">
-          <a:schemeClr val="accent1"/>
-        </a:lnRef>
-        <a:fillRef idx="0">
-          <a:schemeClr val="accent1"/>
-        </a:fillRef>
-        <a:effectRef idx="1">
-          <a:schemeClr val="accent1"/>
-        </a:effectRef>
-        <a:fontRef idx="minor">
-          <a:schemeClr val="tx1"/>
-        </a:fontRef>
-      </a:style>
-    </a:lnDef>
-  </a:objectDefaults>
-  <a:extraClrSchemeLst/>
-  <a:extLst>
-    <a:ext uri="{05A4C25C-085E-4340-85A3-A5531E510DB2}">
-      <thm15:themeFamily xmlns:thm15="http://schemas.microsoft.com/office/thememl/2012/main" name="Office Theme" id="{2E142A2C-CD16-42D6-873A-C26D2A0506FA}" vid="{1BDDFF52-6CD6-40A5-AB3C-68EB2F1E4D0A}"/>
-    </a:ext>
-  </a:extLst>
-</a:theme>
 </file>
</xml_diff>